<commit_message>
Verification: Fix with AI, keep live patches selected
Co-Authored-By: Claude Sonnet 5.5 <noreply@anthropic.com>
</commit_message>
<xml_diff>
--- a/docs/PATCHWORK_Manual.docx
+++ b/docs/PATCHWORK_Manual.docx
@@ -9501,6 +9501,125 @@
         <w:t xml:space="preserve">: a before/after slider and a diff map (indigo = expected change inside a patched element, red = unexpected). Run history is kept on the left.</w:t>
       </w:r>
     </w:p>
+    <w:tbl>
+      <w:tblPr>
+        <w:tblW w:type="dxa" w:w="9638"/>
+        <w:tblBorders>
+          <w:top w:val="single" w:color="auto" w:sz="4"/>
+          <w:left w:val="single" w:color="auto" w:sz="4"/>
+          <w:bottom w:val="single" w:color="auto" w:sz="4"/>
+          <w:right w:val="single" w:color="auto" w:sz="4"/>
+          <w:insideH w:val="single" w:color="auto" w:sz="4"/>
+          <w:insideV w:val="single" w:color="auto" w:sz="4"/>
+        </w:tblBorders>
+      </w:tblPr>
+      <w:tblGrid>
+        <w:gridCol w:w="9638"/>
+      </w:tblGrid>
+      <w:tr>
+        <w:tc>
+          <w:tcPr>
+            <w:tcW w:type="dxa" w:w="9638"/>
+            <w:tcBorders>
+              <w:top w:val="single" w:color="EEEBFF" w:sz="4"/>
+              <w:left w:val="single" w:color="4C3FD6" w:sz="24"/>
+              <w:bottom w:val="single" w:color="EEEBFF" w:sz="4"/>
+              <w:right w:val="single" w:color="EEEBFF" w:sz="4"/>
+            </w:tcBorders>
+            <w:shd w:fill="EEEBFF" w:color="auto" w:val="clear"/>
+            <w:tcMar>
+              <w:top w:type="dxa" w:w="140"/>
+              <w:left w:type="dxa" w:w="220"/>
+              <w:bottom w:type="dxa" w:w="120"/>
+              <w:right w:type="dxa" w:w="220"/>
+            </w:tcMar>
+          </w:tcPr>
+          <w:p>
+            <w:pPr>
+              <w:spacing w:after="60"/>
+            </w:pPr>
+            <w:r>
+              <w:rPr>
+                <w:rFonts w:ascii="Calibri" w:cs="Calibri" w:eastAsia="Calibri" w:hAnsi="Calibri"/>
+                <w:b/>
+                <w:bCs/>
+                <w:color w:val="4C3FD6"/>
+                <w:sz w:val="21"/>
+                <w:szCs w:val="21"/>
+              </w:rPr>
+              <w:t xml:space="preserve">Fix with AI</w:t>
+            </w:r>
+          </w:p>
+          <w:p>
+            <w:pPr>
+              <w:spacing w:after="50" w:line="270"/>
+            </w:pPr>
+            <w:r>
+              <w:rPr>
+                <w:rFonts w:ascii="Calibri" w:cs="Calibri" w:eastAsia="Calibri" w:hAnsi="Calibri"/>
+                <w:sz w:val="20"/>
+                <w:szCs w:val="20"/>
+              </w:rPr>
+              <w:t xml:space="preserve">If a run is blocked or has warnings, press </w:t>
+            </w:r>
+            <w:r>
+              <w:rPr>
+                <w:rFonts w:ascii="Calibri" w:cs="Calibri" w:eastAsia="Calibri" w:hAnsi="Calibri"/>
+                <w:b/>
+                <w:bCs/>
+                <w:sz w:val="20"/>
+                <w:szCs w:val="20"/>
+              </w:rPr>
+              <w:t xml:space="preserve">Fix with AI and re-verify</w:t>
+            </w:r>
+            <w:r>
+              <w:rPr>
+                <w:rFonts w:ascii="Calibri" w:cs="Calibri" w:eastAsia="Calibri" w:hAnsi="Calibri"/>
+                <w:sz w:val="20"/>
+                <w:szCs w:val="20"/>
+              </w:rPr>
+              <w:t xml:space="preserve">. PATCHWORK finds the cause, corrects the patch set and re-runs verification; when it passes you are taken to </w:t>
+            </w:r>
+            <w:r>
+              <w:rPr>
+                <w:rFonts w:ascii="Calibri" w:cs="Calibri" w:eastAsia="Calibri" w:hAnsi="Calibri"/>
+                <w:b/>
+                <w:bCs/>
+                <w:sz w:val="20"/>
+                <w:szCs w:val="20"/>
+              </w:rPr>
+              <w:t xml:space="preserve">Releases</w:t>
+            </w:r>
+            <w:r>
+              <w:rPr>
+                <w:rFonts w:ascii="Calibri" w:cs="Calibri" w:eastAsia="Calibri" w:hAnsi="Calibri"/>
+                <w:sz w:val="20"/>
+                <w:szCs w:val="20"/>
+              </w:rPr>
+              <w:t xml:space="preserve"> with that set selected. It adds back live patches the set dropped, and removes patches that cannot apply, hide too much of the page while a critical flow fails, or inject a script that throws. Claude explains the change in plain English when connected; the corrections are deterministic rules. Patches that still need approval are reported, not changed. You still press </w:t>
+            </w:r>
+            <w:r>
+              <w:rPr>
+                <w:rFonts w:ascii="Calibri" w:cs="Calibri" w:eastAsia="Calibri" w:hAnsi="Calibri"/>
+                <w:b/>
+                <w:bCs/>
+                <w:sz w:val="20"/>
+                <w:szCs w:val="20"/>
+              </w:rPr>
+              <w:t xml:space="preserve">Create release</w:t>
+            </w:r>
+            <w:r>
+              <w:rPr>
+                <w:rFonts w:ascii="Calibri" w:cs="Calibri" w:eastAsia="Calibri" w:hAnsi="Calibri"/>
+                <w:sz w:val="20"/>
+                <w:szCs w:val="20"/>
+              </w:rPr>
+              <w:t xml:space="preserve"> yourself.</w:t>
+            </w:r>
+          </w:p>
+        </w:tc>
+      </w:tr>
+    </w:tbl>
     <w:p>
       <w:pPr>
         <w:pStyle w:val="Heading2"/>

</xml_diff>